<commit_message>
v3.5.0-to-v3.4.0 translation: Improved translation of eVitals.16.
</commit_message>
<xml_diff>
--- a/Translation/v3.5.0 to v3.4.0/documentation.docx
+++ b/Translation/v3.5.0 to v3.4.0/documentation.docx
@@ -119,9 +119,11 @@
       <w:r>
         <w:t>, “</w:t>
       </w:r>
+      <w:proofErr w:type="spellStart"/>
       <w:r>
         <w:t>NotRecorded</w:t>
       </w:r>
+      <w:proofErr w:type="spellEnd"/>
       <w:r>
         <w:t>”</w:t>
       </w:r>
@@ -154,9 +156,11 @@
       <w:r>
         <w:t xml:space="preserve"> </w:t>
       </w:r>
+      <w:proofErr w:type="spellStart"/>
       <w:r>
         <w:t>eDisposition.IncidentDispositionGroup</w:t>
       </w:r>
+      <w:proofErr w:type="spellEnd"/>
       <w:r>
         <w:t xml:space="preserve"> for “Transport by Another EMS Unit…” and “No Patient…”)</w:t>
       </w:r>
@@ -198,7 +202,23 @@
         <w:t>Milligrams per Hour (mg</w:t>
       </w:r>
       <w:r>
-        <w:t xml:space="preserve">/hr)” in eMedications.DosageGroup; </w:t>
+        <w:t>/</w:t>
+      </w:r>
+      <w:proofErr w:type="spellStart"/>
+      <w:r>
+        <w:t>hr</w:t>
+      </w:r>
+      <w:proofErr w:type="spellEnd"/>
+      <w:r>
+        <w:t xml:space="preserve">)” in </w:t>
+      </w:r>
+      <w:proofErr w:type="spellStart"/>
+      <w:r>
+        <w:t>eMedications.DosageGroup</w:t>
+      </w:r>
+      <w:proofErr w:type="spellEnd"/>
+      <w:r>
+        <w:t xml:space="preserve">; </w:t>
       </w:r>
       <w:bookmarkStart w:id="0" w:name="_Hlk92362542"/>
       <w:r>
@@ -208,9 +228,11 @@
         <w:t xml:space="preserve">: “Dead…” and “Assist…” in </w:t>
       </w:r>
       <w:bookmarkEnd w:id="0"/>
+      <w:proofErr w:type="spellStart"/>
       <w:r>
         <w:t>eDisposition.IncidentDispositionGroup</w:t>
       </w:r>
+      <w:proofErr w:type="spellEnd"/>
       <w:r>
         <w:t>)</w:t>
       </w:r>
@@ -276,6 +298,10 @@
       </w:r>
       <w:r>
         <w:t>)</w:t>
+      </w:r>
+      <w:r>
+        <w:br/>
+        <w:t>June 30, 2025 (improved translation: eVitals.16)</w:t>
       </w:r>
     </w:p>
     <w:p>
@@ -1257,6 +1283,7 @@
                 <w:sz w:val="18"/>
                 <w:szCs w:val="18"/>
               </w:rPr>
+              <w:lastRenderedPageBreak/>
               <w:t>dPersonnel.40</w:t>
             </w:r>
           </w:p>
@@ -1303,14 +1330,15 @@
                 <w:szCs w:val="18"/>
               </w:rPr>
             </w:pPr>
-            <w:r>
-              <w:rPr>
-                <w:sz w:val="18"/>
-                <w:szCs w:val="18"/>
-              </w:rPr>
-              <w:lastRenderedPageBreak/>
+            <w:proofErr w:type="spellStart"/>
+            <w:r>
+              <w:rPr>
+                <w:sz w:val="18"/>
+                <w:szCs w:val="18"/>
+              </w:rPr>
               <w:t>sSoftware</w:t>
             </w:r>
+            <w:proofErr w:type="spellEnd"/>
           </w:p>
         </w:tc>
         <w:tc>
@@ -1348,6 +1376,7 @@
                 <w:szCs w:val="18"/>
               </w:rPr>
             </w:pPr>
+            <w:proofErr w:type="spellStart"/>
             <w:r>
               <w:rPr>
                 <w:sz w:val="18"/>
@@ -1355,6 +1384,7 @@
               </w:rPr>
               <w:t>sSoftware.SoftwareGroup</w:t>
             </w:r>
+            <w:proofErr w:type="spellEnd"/>
           </w:p>
         </w:tc>
         <w:tc>
@@ -1531,25 +1561,7 @@
     <w:p/>
     <w:p>
       <w:r>
-        <w:t xml:space="preserve">The translation does not implement any mapping </w:t>
-      </w:r>
-      <w:r>
-        <w:t>from v3.5.0 elements ePatient.25 and dPersonnel.40 to</w:t>
-      </w:r>
-      <w:r>
-        <w:t xml:space="preserve"> </w:t>
-      </w:r>
-      <w:r>
-        <w:t xml:space="preserve">v3.4.0 </w:t>
-      </w:r>
-      <w:r>
-        <w:t>elements ePatient.13</w:t>
-      </w:r>
-      <w:r>
-        <w:t xml:space="preserve"> and </w:t>
-      </w:r>
-      <w:r>
-        <w:t>dPersonnel.12.</w:t>
+        <w:t>The translation does not implement any mapping from v3.5.0 elements ePatient.25 and dPersonnel.40 to v3.4.0 elements ePatient.13 and dPersonnel.12.</w:t>
       </w:r>
     </w:p>
     <w:p>
@@ -1577,20 +1589,41 @@
         <w:keepNext/>
       </w:pPr>
       <w:r>
-        <w:t>The following elements that are nillable in v3.5.0</w:t>
+        <w:t xml:space="preserve">The following elements that are </w:t>
+      </w:r>
+      <w:proofErr w:type="spellStart"/>
+      <w:r>
+        <w:t>nillable</w:t>
+      </w:r>
+      <w:proofErr w:type="spellEnd"/>
+      <w:r>
+        <w:t xml:space="preserve"> in v3.5.0</w:t>
       </w:r>
       <w:r>
         <w:t xml:space="preserve"> </w:t>
       </w:r>
       <w:r>
-        <w:t xml:space="preserve">are not nillable in v3.4.0. </w:t>
+        <w:t xml:space="preserve">are not </w:t>
+      </w:r>
+      <w:proofErr w:type="spellStart"/>
+      <w:r>
+        <w:t>nillable</w:t>
+      </w:r>
+      <w:proofErr w:type="spellEnd"/>
+      <w:r>
+        <w:t xml:space="preserve"> in v3.4.0. </w:t>
       </w:r>
       <w:r>
         <w:t>R</w:t>
       </w:r>
       <w:r>
-        <w:t>emove if</w:t>
-      </w:r>
+        <w:t xml:space="preserve">emove </w:t>
+      </w:r>
+      <w:proofErr w:type="gramStart"/>
+      <w:r>
+        <w:t>if</w:t>
+      </w:r>
+      <w:proofErr w:type="gramEnd"/>
       <w:r>
         <w:t xml:space="preserve"> empty</w:t>
       </w:r>
@@ -2488,7 +2521,23 @@
                 <w:sz w:val="18"/>
                 <w:szCs w:val="18"/>
               </w:rPr>
-              <w:t>Patient Monitoring Capability(ies)</w:t>
+              <w:t>Patient Monitoring Capability(</w:t>
+            </w:r>
+            <w:proofErr w:type="spellStart"/>
+            <w:r>
+              <w:rPr>
+                <w:sz w:val="18"/>
+                <w:szCs w:val="18"/>
+              </w:rPr>
+              <w:t>ies</w:t>
+            </w:r>
+            <w:proofErr w:type="spellEnd"/>
+            <w:r>
+              <w:rPr>
+                <w:sz w:val="18"/>
+                <w:szCs w:val="18"/>
+              </w:rPr>
+              <w:t>)</w:t>
             </w:r>
           </w:p>
         </w:tc>
@@ -3357,7 +3406,11 @@
         <w:t xml:space="preserve">Add the </w:t>
       </w:r>
       <w:r>
-        <w:t>following v3.4.0 required elements that were retired in v3.5.0</w:t>
+        <w:t>following v3.4.0 required elements that were retired in v3.</w:t>
+      </w:r>
+      <w:proofErr w:type="gramStart"/>
+      <w:r>
+        <w:t>5.0</w:t>
       </w:r>
       <w:r>
         <w:t>,</w:t>
@@ -3366,7 +3419,11 @@
         <w:t xml:space="preserve"> </w:t>
       </w:r>
       <w:r>
-        <w:t xml:space="preserve">and set </w:t>
+        <w:t>and</w:t>
+      </w:r>
+      <w:proofErr w:type="gramEnd"/>
+      <w:r>
+        <w:t xml:space="preserve"> set </w:t>
       </w:r>
       <w:r>
         <w:t>to Not Value = 7701003 (Not Recorded).</w:t>
@@ -3672,13 +3729,21 @@
         <w:t xml:space="preserve"> or empty</w:t>
       </w:r>
       <w:r>
-        <w:t>, ad</w:t>
+        <w:t xml:space="preserve">, </w:t>
+      </w:r>
+      <w:proofErr w:type="gramStart"/>
+      <w:r>
+        <w:t>ad</w:t>
       </w:r>
       <w:r>
         <w:t>d</w:t>
       </w:r>
       <w:r>
-        <w:t xml:space="preserve"> with the following values</w:t>
+        <w:t xml:space="preserve"> with</w:t>
+      </w:r>
+      <w:proofErr w:type="gramEnd"/>
+      <w:r>
+        <w:t xml:space="preserve"> the following values</w:t>
       </w:r>
       <w:r>
         <w:t>.</w:t>
@@ -3973,7 +4038,23 @@
                 <w:sz w:val="18"/>
                 <w:szCs w:val="18"/>
               </w:rPr>
-              <w:t>Patient Monitoring Capability(ies)</w:t>
+              <w:t>Patient Monitoring Capability(</w:t>
+            </w:r>
+            <w:proofErr w:type="spellStart"/>
+            <w:r>
+              <w:rPr>
+                <w:sz w:val="18"/>
+                <w:szCs w:val="18"/>
+              </w:rPr>
+              <w:t>ies</w:t>
+            </w:r>
+            <w:proofErr w:type="spellEnd"/>
+            <w:r>
+              <w:rPr>
+                <w:sz w:val="18"/>
+                <w:szCs w:val="18"/>
+              </w:rPr>
+              <w:t>)</w:t>
             </w:r>
           </w:p>
         </w:tc>
@@ -4593,9 +4674,11 @@
       <w:pPr>
         <w:pStyle w:val="Heading1"/>
       </w:pPr>
+      <w:proofErr w:type="gramStart"/>
       <w:r>
         <w:t>@UUID</w:t>
       </w:r>
+      <w:proofErr w:type="gramEnd"/>
     </w:p>
     <w:p>
       <w:r>
@@ -4927,12 +5010,21 @@
                 <w:szCs w:val="18"/>
               </w:rPr>
             </w:pPr>
-            <w:r>
-              <w:rPr>
-                <w:sz w:val="18"/>
-                <w:szCs w:val="18"/>
-              </w:rPr>
-              <w:t>Symptom Not Present</w:t>
+            <w:proofErr w:type="gramStart"/>
+            <w:r>
+              <w:rPr>
+                <w:sz w:val="18"/>
+                <w:szCs w:val="18"/>
+              </w:rPr>
+              <w:t>Symptom</w:t>
+            </w:r>
+            <w:proofErr w:type="gramEnd"/>
+            <w:r>
+              <w:rPr>
+                <w:sz w:val="18"/>
+                <w:szCs w:val="18"/>
+              </w:rPr>
+              <w:t xml:space="preserve"> Not Present</w:t>
             </w:r>
           </w:p>
         </w:tc>
@@ -4958,7 +5050,15 @@
         <w:t>new</w:t>
       </w:r>
       <w:r>
-        <w:t xml:space="preserve"> in 3.5.0 as follows.</w:t>
+        <w:t xml:space="preserve"> in 3.5.0 </w:t>
+      </w:r>
+      <w:proofErr w:type="gramStart"/>
+      <w:r>
+        <w:t>as</w:t>
+      </w:r>
+      <w:proofErr w:type="gramEnd"/>
+      <w:r>
+        <w:t xml:space="preserve"> follows.</w:t>
       </w:r>
     </w:p>
     <w:tbl>
@@ -6278,12 +6378,21 @@
                 <w:szCs w:val="18"/>
               </w:rPr>
             </w:pPr>
-            <w:r>
-              <w:rPr>
-                <w:sz w:val="18"/>
-                <w:szCs w:val="18"/>
-              </w:rPr>
-              <w:t>Wheel Chair Van/Ambulette</w:t>
+            <w:proofErr w:type="gramStart"/>
+            <w:r>
+              <w:rPr>
+                <w:sz w:val="18"/>
+                <w:szCs w:val="18"/>
+              </w:rPr>
+              <w:t>Wheel Chair</w:t>
+            </w:r>
+            <w:proofErr w:type="gramEnd"/>
+            <w:r>
+              <w:rPr>
+                <w:sz w:val="18"/>
+                <w:szCs w:val="18"/>
+              </w:rPr>
+              <w:t xml:space="preserve"> Van/Ambulette</w:t>
             </w:r>
           </w:p>
         </w:tc>
@@ -7463,7 +7572,23 @@
                 <w:sz w:val="18"/>
                 <w:szCs w:val="18"/>
               </w:rPr>
-              <w:t>Other, neither exclusively male or female</w:t>
+              <w:t xml:space="preserve">Other, neither exclusively male </w:t>
+            </w:r>
+            <w:proofErr w:type="gramStart"/>
+            <w:r>
+              <w:rPr>
+                <w:sz w:val="18"/>
+                <w:szCs w:val="18"/>
+              </w:rPr>
+              <w:t>or</w:t>
+            </w:r>
+            <w:proofErr w:type="gramEnd"/>
+            <w:r>
+              <w:rPr>
+                <w:sz w:val="18"/>
+                <w:szCs w:val="18"/>
+              </w:rPr>
+              <w:t xml:space="preserve"> female</w:t>
             </w:r>
           </w:p>
         </w:tc>
@@ -10447,7 +10572,23 @@
                 <w:sz w:val="18"/>
                 <w:szCs w:val="18"/>
               </w:rPr>
-              <w:t>Rapid Arterial oCclusion Evaluation (RACE)</w:t>
+              <w:t xml:space="preserve">Rapid Arterial </w:t>
+            </w:r>
+            <w:proofErr w:type="spellStart"/>
+            <w:r>
+              <w:rPr>
+                <w:sz w:val="18"/>
+                <w:szCs w:val="18"/>
+              </w:rPr>
+              <w:t>oCclusion</w:t>
+            </w:r>
+            <w:proofErr w:type="spellEnd"/>
+            <w:r>
+              <w:rPr>
+                <w:sz w:val="18"/>
+                <w:szCs w:val="18"/>
+              </w:rPr>
+              <w:t xml:space="preserve"> Evaluation (RACE)</w:t>
             </w:r>
           </w:p>
           <w:p>
@@ -14480,6 +14621,7 @@
                 <w:szCs w:val="18"/>
               </w:rPr>
             </w:pPr>
+            <w:proofErr w:type="gramStart"/>
             <w:r>
               <w:rPr>
                 <w:sz w:val="18"/>
@@ -14487,6 +14629,7 @@
               </w:rPr>
               <w:t>Yes-Other</w:t>
             </w:r>
+            <w:proofErr w:type="gramEnd"/>
           </w:p>
         </w:tc>
       </w:tr>
@@ -15130,6 +15273,7 @@
                 <w:szCs w:val="18"/>
               </w:rPr>
             </w:pPr>
+            <w:proofErr w:type="spellStart"/>
             <w:r>
               <w:rPr>
                 <w:sz w:val="18"/>
@@ -15137,6 +15281,7 @@
               </w:rPr>
               <w:t>ePCR</w:t>
             </w:r>
+            <w:proofErr w:type="spellEnd"/>
           </w:p>
         </w:tc>
         <w:tc>
@@ -21423,14 +21568,25 @@
                 <w:szCs w:val="18"/>
               </w:rPr>
             </w:pPr>
-            <w:r>
-              <w:rPr>
-                <w:rFonts w:cstheme="minorHAnsi"/>
-                <w:color w:val="000000"/>
-                <w:sz w:val="18"/>
-                <w:szCs w:val="18"/>
-              </w:rPr>
-              <w:t>Wheel Chair Van/Ambulette</w:t>
+            <w:proofErr w:type="gramStart"/>
+            <w:r>
+              <w:rPr>
+                <w:rFonts w:cstheme="minorHAnsi"/>
+                <w:color w:val="000000"/>
+                <w:sz w:val="18"/>
+                <w:szCs w:val="18"/>
+              </w:rPr>
+              <w:t>Wheel Chair</w:t>
+            </w:r>
+            <w:proofErr w:type="gramEnd"/>
+            <w:r>
+              <w:rPr>
+                <w:rFonts w:cstheme="minorHAnsi"/>
+                <w:color w:val="000000"/>
+                <w:sz w:val="18"/>
+                <w:szCs w:val="18"/>
+              </w:rPr>
+              <w:t xml:space="preserve"> Van/Ambulette</w:t>
             </w:r>
           </w:p>
         </w:tc>
@@ -23313,8 +23469,13 @@
       <w:r>
         <w:t xml:space="preserve">Truncate </w:t>
       </w:r>
-      <w:r>
-        <w:t xml:space="preserve">ICD-10 code </w:t>
+      <w:proofErr w:type="gramStart"/>
+      <w:r>
+        <w:t>ICD</w:t>
+      </w:r>
+      <w:proofErr w:type="gramEnd"/>
+      <w:r>
+        <w:t xml:space="preserve">-10 code </w:t>
       </w:r>
       <w:r>
         <w:t>to 7 characters.</w:t>
@@ -23400,8 +23561,13 @@
       </w:r>
     </w:p>
     <w:p>
-      <w:r>
-        <w:t>Map the following values:</w:t>
+      <w:proofErr w:type="gramStart"/>
+      <w:r>
+        <w:t>Map</w:t>
+      </w:r>
+      <w:proofErr w:type="gramEnd"/>
+      <w:r>
+        <w:t xml:space="preserve"> the following values:</w:t>
       </w:r>
     </w:p>
     <w:tbl>
@@ -23695,7 +23861,23 @@
                 <w:sz w:val="18"/>
                 <w:szCs w:val="18"/>
               </w:rPr>
-              <w:t>Active bleeding requiring a tourniquet or wound packing with continuous pressure</w:t>
+              <w:t xml:space="preserve">Active </w:t>
+            </w:r>
+            <w:proofErr w:type="gramStart"/>
+            <w:r>
+              <w:rPr>
+                <w:sz w:val="18"/>
+                <w:szCs w:val="18"/>
+              </w:rPr>
+              <w:t>bleeding requiring</w:t>
+            </w:r>
+            <w:proofErr w:type="gramEnd"/>
+            <w:r>
+              <w:rPr>
+                <w:sz w:val="18"/>
+                <w:szCs w:val="18"/>
+              </w:rPr>
+              <w:t xml:space="preserve"> a tourniquet or wound packing with continuous pressure</w:t>
             </w:r>
           </w:p>
         </w:tc>
@@ -24792,8 +24974,13 @@
       </w:r>
     </w:p>
     <w:p>
-      <w:r>
-        <w:t>Map the following values:</w:t>
+      <w:proofErr w:type="gramStart"/>
+      <w:r>
+        <w:t>Map</w:t>
+      </w:r>
+      <w:proofErr w:type="gramEnd"/>
+      <w:r>
+        <w:t xml:space="preserve"> the following values:</w:t>
       </w:r>
     </w:p>
     <w:tbl>
@@ -25294,12 +25481,53 @@
                 <w:szCs w:val="18"/>
               </w:rPr>
             </w:pPr>
-            <w:r>
-              <w:rPr>
-                <w:sz w:val="18"/>
-                <w:szCs w:val="18"/>
-              </w:rPr>
-              <w:t>Rider separated from transport vehicle with significant impact (eg, motorcycle, ATV, horse, etc.)</w:t>
+            <w:proofErr w:type="gramStart"/>
+            <w:r>
+              <w:rPr>
+                <w:sz w:val="18"/>
+                <w:szCs w:val="18"/>
+              </w:rPr>
+              <w:t>Rider</w:t>
+            </w:r>
+            <w:proofErr w:type="gramEnd"/>
+            <w:r>
+              <w:rPr>
+                <w:sz w:val="18"/>
+                <w:szCs w:val="18"/>
+              </w:rPr>
+              <w:t xml:space="preserve"> separated from transport </w:t>
+            </w:r>
+            <w:proofErr w:type="gramStart"/>
+            <w:r>
+              <w:rPr>
+                <w:sz w:val="18"/>
+                <w:szCs w:val="18"/>
+              </w:rPr>
+              <w:t>vehicle</w:t>
+            </w:r>
+            <w:proofErr w:type="gramEnd"/>
+            <w:r>
+              <w:rPr>
+                <w:sz w:val="18"/>
+                <w:szCs w:val="18"/>
+              </w:rPr>
+              <w:t xml:space="preserve"> with significant impact (</w:t>
+            </w:r>
+            <w:proofErr w:type="spellStart"/>
+            <w:r>
+              <w:rPr>
+                <w:sz w:val="18"/>
+                <w:szCs w:val="18"/>
+              </w:rPr>
+              <w:t>eg</w:t>
+            </w:r>
+            <w:proofErr w:type="spellEnd"/>
+            <w:r>
+              <w:rPr>
+                <w:sz w:val="18"/>
+                <w:szCs w:val="18"/>
+              </w:rPr>
+              <w:t>, motorcycle, ATV, horse, etc.)</w:t>
             </w:r>
           </w:p>
         </w:tc>
@@ -25656,13 +25884,19 @@
       <w:pPr>
         <w:pStyle w:val="Heading1"/>
       </w:pPr>
+      <w:proofErr w:type="spellStart"/>
       <w:r>
         <w:t>eHistory.ImmunizationsGroup</w:t>
       </w:r>
+      <w:proofErr w:type="spellEnd"/>
       <w:r>
         <w:br/>
+      </w:r>
+      <w:proofErr w:type="spellStart"/>
+      <w:r>
         <w:t>dPersonnel.ImmunizationsGroup</w:t>
       </w:r>
+      <w:proofErr w:type="spellEnd"/>
     </w:p>
     <w:p>
       <w:r>
@@ -25736,7 +25970,13 @@
         <w:t>C</w:t>
       </w:r>
       <w:r>
-        <w:t>onvert Percentage and kPa values to mmHg and remove the ETCO2CodeType attribute.</w:t>
+        <w:t xml:space="preserve">onvert Percentage and kPa values to mmHg and remove the </w:t>
+      </w:r>
+      <w:r>
+        <w:t>ETCO2Type</w:t>
+      </w:r>
+      <w:r>
+        <w:t xml:space="preserve"> attribute.</w:t>
       </w:r>
     </w:p>
     <w:p>
@@ -25764,12 +26004,6 @@
         <w:rPr>
           <w:rFonts w:ascii="Consolas" w:hAnsi="Consolas"/>
         </w:rPr>
-        <w:t>round(</w:t>
-      </w:r>
-      <w:r>
-        <w:rPr>
-          <w:rFonts w:ascii="Consolas" w:hAnsi="Consolas"/>
-        </w:rPr>
         <w:t>(</w:t>
       </w:r>
       <w:r>
@@ -25842,12 +26076,18 @@
         <w:rPr>
           <w:rFonts w:ascii="Consolas" w:hAnsi="Consolas"/>
         </w:rPr>
-        <w:t xml:space="preserve"> 100)</w:t>
+        <w:t xml:space="preserve"> 100</w:t>
       </w:r>
     </w:p>
     <w:p>
       <w:r>
-        <w:t xml:space="preserve">kPa: 1kPa is 7.5mmHg. </w:t>
+        <w:t xml:space="preserve">kPa: 1kPa </w:t>
+      </w:r>
+      <w:r>
+        <w:t>=</w:t>
+      </w:r>
+      <w:r>
+        <w:t xml:space="preserve"> 7.5mmHg. </w:t>
       </w:r>
       <w:r>
         <w:t>T</w:t>
@@ -25868,7 +26108,7 @@
           <w:rFonts w:ascii="Consolas" w:hAnsi="Consolas"/>
         </w:rPr>
         <w:lastRenderedPageBreak/>
-        <w:t xml:space="preserve">round(value </w:t>
+        <w:t xml:space="preserve">value </w:t>
       </w:r>
       <w:r>
         <w:rPr>
@@ -25888,19 +26128,33 @@
         </w:rPr>
         <w:t>7.5</w:t>
       </w:r>
-      <w:r>
-        <w:rPr>
-          <w:rFonts w:ascii="Consolas" w:hAnsi="Consolas"/>
-        </w:rPr>
-        <w:t>)</w:t>
-      </w:r>
     </w:p>
     <w:p>
       <w:r>
-        <w:t>If the ETCO2CodeType attribute is missing</w:t>
-      </w:r>
-      <w:r>
-        <w:t>, assume mmHg, round the value, and limit the value to a maximum of 200.</w:t>
+        <w:t xml:space="preserve">If the </w:t>
+      </w:r>
+      <w:r>
+        <w:t>ETCO2Type</w:t>
+      </w:r>
+      <w:r>
+        <w:t xml:space="preserve"> attribute is missing</w:t>
+      </w:r>
+      <w:r>
+        <w:t>, assume mmHg</w:t>
+      </w:r>
+      <w:r>
+        <w:t>.</w:t>
+      </w:r>
+    </w:p>
+    <w:p>
+      <w:r>
+        <w:t xml:space="preserve">After converting the value if applicable, if </w:t>
+      </w:r>
+      <w:r>
+        <w:t>it</w:t>
+      </w:r>
+      <w:r>
+        <w:t xml:space="preserve"> is between 0 and 200, round it. Otherwise, remove it.</w:t>
       </w:r>
     </w:p>
     <w:p>
@@ -26048,7 +26302,25 @@
                 <w:sz w:val="18"/>
                 <w:szCs w:val="18"/>
               </w:rPr>
-              <w:t>ACT Celite (ACTc)</w:t>
+              <w:t>ACT Celite (</w:t>
+            </w:r>
+            <w:proofErr w:type="spellStart"/>
+            <w:r>
+              <w:rPr>
+                <w:rFonts w:cstheme="minorHAnsi"/>
+                <w:sz w:val="18"/>
+                <w:szCs w:val="18"/>
+              </w:rPr>
+              <w:t>ACTc</w:t>
+            </w:r>
+            <w:proofErr w:type="spellEnd"/>
+            <w:r>
+              <w:rPr>
+                <w:rFonts w:cstheme="minorHAnsi"/>
+                <w:sz w:val="18"/>
+                <w:szCs w:val="18"/>
+              </w:rPr>
+              <w:t>)</w:t>
             </w:r>
           </w:p>
         </w:tc>
@@ -26103,7 +26375,25 @@
                 <w:sz w:val="18"/>
                 <w:szCs w:val="18"/>
               </w:rPr>
-              <w:t>ACT Kaolin (ACTk)</w:t>
+              <w:t>ACT Kaolin (</w:t>
+            </w:r>
+            <w:proofErr w:type="spellStart"/>
+            <w:r>
+              <w:rPr>
+                <w:rFonts w:cstheme="minorHAnsi"/>
+                <w:sz w:val="18"/>
+                <w:szCs w:val="18"/>
+              </w:rPr>
+              <w:t>ACTk</w:t>
+            </w:r>
+            <w:proofErr w:type="spellEnd"/>
+            <w:r>
+              <w:rPr>
+                <w:rFonts w:cstheme="minorHAnsi"/>
+                <w:sz w:val="18"/>
+                <w:szCs w:val="18"/>
+              </w:rPr>
+              <w:t>)</w:t>
             </w:r>
           </w:p>
         </w:tc>
@@ -26543,7 +26833,25 @@
                 <w:sz w:val="18"/>
                 <w:szCs w:val="18"/>
               </w:rPr>
-              <w:t>High-Sensitivity C-reactive Protein (hs-CRP)</w:t>
+              <w:t>High-Sensitivity C-reactive Protein (</w:t>
+            </w:r>
+            <w:proofErr w:type="spellStart"/>
+            <w:r>
+              <w:rPr>
+                <w:rFonts w:cstheme="minorHAnsi"/>
+                <w:sz w:val="18"/>
+                <w:szCs w:val="18"/>
+              </w:rPr>
+              <w:t>hs</w:t>
+            </w:r>
+            <w:proofErr w:type="spellEnd"/>
+            <w:r>
+              <w:rPr>
+                <w:rFonts w:cstheme="minorHAnsi"/>
+                <w:sz w:val="18"/>
+                <w:szCs w:val="18"/>
+              </w:rPr>
+              <w:t>-CRP)</w:t>
             </w:r>
           </w:p>
         </w:tc>
@@ -27142,13 +27450,23 @@
                 <w:szCs w:val="18"/>
               </w:rPr>
             </w:pPr>
-            <w:r>
-              <w:rPr>
-                <w:rFonts w:cstheme="minorHAnsi"/>
-                <w:sz w:val="18"/>
-                <w:szCs w:val="18"/>
-              </w:rPr>
-              <w:t>Prothromblin test time (PT/INR)</w:t>
+            <w:proofErr w:type="spellStart"/>
+            <w:r>
+              <w:rPr>
+                <w:rFonts w:cstheme="minorHAnsi"/>
+                <w:sz w:val="18"/>
+                <w:szCs w:val="18"/>
+              </w:rPr>
+              <w:t>Prothromblin</w:t>
+            </w:r>
+            <w:proofErr w:type="spellEnd"/>
+            <w:r>
+              <w:rPr>
+                <w:rFonts w:cstheme="minorHAnsi"/>
+                <w:sz w:val="18"/>
+                <w:szCs w:val="18"/>
+              </w:rPr>
+              <w:t xml:space="preserve"> test time (PT/INR)</w:t>
             </w:r>
           </w:p>
         </w:tc>
@@ -27838,6 +28156,7 @@
       <w:pPr>
         <w:pStyle w:val="Heading1"/>
       </w:pPr>
+      <w:proofErr w:type="spellStart"/>
       <w:r>
         <w:lastRenderedPageBreak/>
         <w:t>eExam.</w:t>
@@ -27845,14 +28164,35 @@
       <w:r>
         <w:t>LungGroup</w:t>
       </w:r>
+      <w:proofErr w:type="spellEnd"/>
       <w:r>
         <w:br/>
+      </w:r>
+      <w:proofErr w:type="spellStart"/>
+      <w:r>
         <w:t>eExam.ChestGroup</w:t>
       </w:r>
+      <w:proofErr w:type="spellEnd"/>
     </w:p>
     <w:p>
       <w:r>
-        <w:t>Map values from new elements in v3.5.0 eExam.LungGroup and eExam.ChestGroup to v3.4.0 eExam.08. In</w:t>
+        <w:t xml:space="preserve">Map values from new elements in v3.5.0 </w:t>
+      </w:r>
+      <w:proofErr w:type="spellStart"/>
+      <w:r>
+        <w:t>eExam.LungGroup</w:t>
+      </w:r>
+      <w:proofErr w:type="spellEnd"/>
+      <w:r>
+        <w:t xml:space="preserve"> and </w:t>
+      </w:r>
+      <w:proofErr w:type="spellStart"/>
+      <w:r>
+        <w:t>eExam.ChestGroup</w:t>
+      </w:r>
+      <w:proofErr w:type="spellEnd"/>
+      <w:r>
+        <w:t xml:space="preserve"> to v3.4.0 eExam.08. In</w:t>
       </w:r>
       <w:r>
         <w:t xml:space="preserve"> mappings</w:t>
@@ -27861,8 +28201,21 @@
         <w:t xml:space="preserve"> that create multiple instances of eExam.08</w:t>
       </w:r>
       <w:r>
-        <w:t xml:space="preserve"> from a single instance of eExam.LungGroup or eExam.ChestGroup</w:t>
-      </w:r>
+        <w:t xml:space="preserve"> from a single instance of </w:t>
+      </w:r>
+      <w:proofErr w:type="spellStart"/>
+      <w:r>
+        <w:t>eExam.LungGroup</w:t>
+      </w:r>
+      <w:proofErr w:type="spellEnd"/>
+      <w:r>
+        <w:t xml:space="preserve"> or </w:t>
+      </w:r>
+      <w:proofErr w:type="spellStart"/>
+      <w:r>
+        <w:t>eExam.ChestGroup</w:t>
+      </w:r>
+      <w:proofErr w:type="spellEnd"/>
       <w:r>
         <w:t xml:space="preserve">, </w:t>
       </w:r>
@@ -27883,11 +28236,21 @@
       <w:r>
         <w:t xml:space="preserve">Values are mapped </w:t>
       </w:r>
+      <w:proofErr w:type="gramStart"/>
       <w:r>
         <w:t>from</w:t>
       </w:r>
-      <w:r>
-        <w:t xml:space="preserve"> eExam.LungGroup as follows</w:t>
+      <w:proofErr w:type="gramEnd"/>
+      <w:r>
+        <w:t xml:space="preserve"> </w:t>
+      </w:r>
+      <w:proofErr w:type="spellStart"/>
+      <w:r>
+        <w:t>eExam.LungGroup</w:t>
+      </w:r>
+      <w:proofErr w:type="spellEnd"/>
+      <w:r>
+        <w:t xml:space="preserve"> as follows</w:t>
       </w:r>
       <w:r>
         <w:t>.</w:t>
@@ -34439,7 +34802,15 @@
         <w:t>from</w:t>
       </w:r>
       <w:r>
-        <w:t xml:space="preserve"> eExam.ChestGroup as follows</w:t>
+        <w:t xml:space="preserve"> </w:t>
+      </w:r>
+      <w:proofErr w:type="spellStart"/>
+      <w:r>
+        <w:t>eExam.ChestGroup</w:t>
+      </w:r>
+      <w:proofErr w:type="spellEnd"/>
+      <w:r>
+        <w:t xml:space="preserve"> as follows</w:t>
       </w:r>
       <w:r>
         <w:t>.</w:t>
@@ -40557,16 +40928,34 @@
     </w:p>
     <w:p>
       <w:r>
-        <w:t>Remove CodeType attribute. Remove value and Pertinent Negative (if present) and set Not Value = 7701003 (Not Recorded) if CodeType is 9924005 (SNOMED) or value is longer than 7 characters.</w:t>
+        <w:t xml:space="preserve">Remove </w:t>
+      </w:r>
+      <w:proofErr w:type="spellStart"/>
+      <w:r>
+        <w:t>CodeType</w:t>
+      </w:r>
+      <w:proofErr w:type="spellEnd"/>
+      <w:r>
+        <w:t xml:space="preserve"> attribute. Remove value and Pertinent Negative (if present) and set Not Value = 7701003 (Not Recorded) if </w:t>
+      </w:r>
+      <w:proofErr w:type="spellStart"/>
+      <w:r>
+        <w:t>CodeType</w:t>
+      </w:r>
+      <w:proofErr w:type="spellEnd"/>
+      <w:r>
+        <w:t xml:space="preserve"> is 9924005 (SNOMED) or value is longer than 7 characters.</w:t>
       </w:r>
     </w:p>
     <w:p>
       <w:pPr>
         <w:pStyle w:val="Heading1"/>
       </w:pPr>
+      <w:proofErr w:type="spellStart"/>
       <w:r>
         <w:t>eMedications.DosageGroup</w:t>
       </w:r>
+      <w:proofErr w:type="spellEnd"/>
     </w:p>
     <w:p>
       <w:r>
@@ -40582,7 +40971,15 @@
         <w:t>Milligrams per Hour (mg</w:t>
       </w:r>
       <w:r>
-        <w:t xml:space="preserve">/hr)). </w:t>
+        <w:t>/</w:t>
+      </w:r>
+      <w:proofErr w:type="spellStart"/>
+      <w:r>
+        <w:t>hr</w:t>
+      </w:r>
+      <w:proofErr w:type="spellEnd"/>
+      <w:r>
+        <w:t xml:space="preserve">)). </w:t>
       </w:r>
       <w:r>
         <w:t>C</w:t>
@@ -40613,6 +41010,7 @@
         </w:rPr>
         <w:t xml:space="preserve"> ÷ 60</w:t>
       </w:r>
+      <w:proofErr w:type="gramStart"/>
       <w:r>
         <w:rPr>
           <w:rFonts w:ascii="Consolas" w:hAnsi="Consolas"/>
@@ -40629,7 +41027,14 @@
         <w:rPr>
           <w:rFonts w:ascii="Consolas" w:hAnsi="Consolas"/>
         </w:rPr>
-        <w:t>'#.###')</w:t>
+        <w:t>'#.###'</w:t>
+      </w:r>
+      <w:proofErr w:type="gramEnd"/>
+      <w:r>
+        <w:rPr>
+          <w:rFonts w:ascii="Consolas" w:hAnsi="Consolas"/>
+        </w:rPr>
+        <w:t>)</w:t>
       </w:r>
     </w:p>
     <w:p>
@@ -40671,7 +41076,15 @@
     </w:p>
     <w:p>
       <w:r>
-        <w:t xml:space="preserve">Remove instances with value </w:t>
+        <w:t xml:space="preserve">Remove instances with </w:t>
+      </w:r>
+      <w:proofErr w:type="gramStart"/>
+      <w:r>
+        <w:t>value</w:t>
+      </w:r>
+      <w:proofErr w:type="gramEnd"/>
+      <w:r>
+        <w:t xml:space="preserve"> </w:t>
       </w:r>
       <w:r>
         <w:t>less than 8.</w:t>
@@ -40685,7 +41098,15 @@
         <w:t xml:space="preserve">eDisposition.15 - </w:t>
       </w:r>
       <w:r>
-        <w:t>How Patient Was Moved From Ambulance</w:t>
+        <w:t xml:space="preserve">How Patient Was Moved </w:t>
+      </w:r>
+      <w:proofErr w:type="gramStart"/>
+      <w:r>
+        <w:t>From</w:t>
+      </w:r>
+      <w:proofErr w:type="gramEnd"/>
+      <w:r>
+        <w:t xml:space="preserve"> Ambulance</w:t>
       </w:r>
     </w:p>
     <w:p>
@@ -40699,16 +41120,26 @@
         <w:t>y</w:t>
       </w:r>
       <w:r>
-        <w:t xml:space="preserve"> the first instance (and remove @CorrelationID) and remove all other instances.</w:t>
+        <w:t xml:space="preserve"> the first instance (and </w:t>
+      </w:r>
+      <w:proofErr w:type="gramStart"/>
+      <w:r>
+        <w:t>remove @</w:t>
+      </w:r>
+      <w:proofErr w:type="gramEnd"/>
+      <w:r>
+        <w:t>CorrelationID) and remove all other instances.</w:t>
       </w:r>
     </w:p>
     <w:p>
       <w:pPr>
         <w:pStyle w:val="Heading1"/>
       </w:pPr>
+      <w:proofErr w:type="spellStart"/>
       <w:r>
         <w:t>eDisposition.IncidentDispositionGroup</w:t>
       </w:r>
+      <w:proofErr w:type="spellEnd"/>
     </w:p>
     <w:p>
       <w:r>
@@ -40768,7 +41199,15 @@
         <w:t>5.0</w:t>
       </w:r>
       <w:r>
-        <w:t xml:space="preserve">, national Schematron rules flag combinations of element values that don’t make sense; however, the rules are warnings, so documents are still considered valid. The mapping uses a hierarchical if/else-if algorithm that starts by looking at the value of </w:t>
+        <w:t>, national Schematron rules flag combinations of element values that don’t make sense; however, the rules are warnings, so documents are still considered valid. The mapping uses a hierarchical if/</w:t>
+      </w:r>
+      <w:proofErr w:type="gramStart"/>
+      <w:r>
+        <w:t>else</w:t>
+      </w:r>
+      <w:proofErr w:type="gramEnd"/>
+      <w:r>
+        <w:t xml:space="preserve">-if algorithm that starts by looking at the value of </w:t>
       </w:r>
       <w:r>
         <w:t>v3.</w:t>
@@ -40777,7 +41216,15 @@
         <w:t>5.0</w:t>
       </w:r>
       <w:r>
-        <w:t xml:space="preserve"> mandatory element eDisposition.27 - Unit Disposition, followed by other elements in eDisposition.IncidentDispositionGroup as needed.</w:t>
+        <w:t xml:space="preserve"> mandatory element eDisposition.27 - Unit Disposition, followed by other elements in </w:t>
+      </w:r>
+      <w:proofErr w:type="spellStart"/>
+      <w:r>
+        <w:t>eDisposition.IncidentDispositionGroup</w:t>
+      </w:r>
+      <w:proofErr w:type="spellEnd"/>
+      <w:r>
+        <w:t xml:space="preserve"> as needed.</w:t>
       </w:r>
       <w:r>
         <w:t xml:space="preserve"> </w:t>
@@ -45975,7 +46422,23 @@
                 <w:sz w:val="18"/>
                 <w:szCs w:val="18"/>
               </w:rPr>
-              <w:t>Canceled (Prior to Arrival At Scene)</w:t>
+              <w:t xml:space="preserve">Canceled (Prior to Arrival </w:t>
+            </w:r>
+            <w:proofErr w:type="gramStart"/>
+            <w:r>
+              <w:rPr>
+                <w:sz w:val="18"/>
+                <w:szCs w:val="18"/>
+              </w:rPr>
+              <w:t>At</w:t>
+            </w:r>
+            <w:proofErr w:type="gramEnd"/>
+            <w:r>
+              <w:rPr>
+                <w:sz w:val="18"/>
+                <w:szCs w:val="18"/>
+              </w:rPr>
+              <w:t xml:space="preserve"> Scene)</w:t>
             </w:r>
           </w:p>
         </w:tc>
@@ -48639,8 +49102,13 @@
       </w:r>
     </w:p>
     <w:p>
-      <w:r>
-        <w:t>Remove @CorrelationID.</w:t>
+      <w:proofErr w:type="gramStart"/>
+      <w:r>
+        <w:t>Remove @</w:t>
+      </w:r>
+      <w:proofErr w:type="gramEnd"/>
+      <w:r>
+        <w:t>CorrelationID.</w:t>
       </w:r>
     </w:p>
     <w:p>
@@ -48655,9 +49123,11 @@
       <w:r>
         <w:t xml:space="preserve">Un-enclose from new element </w:t>
       </w:r>
+      <w:proofErr w:type="spellStart"/>
       <w:r>
         <w:t>eOutcome.EmergencyDepartmentProceduresGroup</w:t>
       </w:r>
+      <w:proofErr w:type="spellEnd"/>
       <w:r>
         <w:t xml:space="preserve">. </w:t>
       </w:r>
@@ -48667,9 +49137,11 @@
       <w:r>
         <w:t xml:space="preserve">@CorrelationID from </w:t>
       </w:r>
+      <w:proofErr w:type="spellStart"/>
       <w:r>
         <w:t>eOutcome.EmergencyDepartmentProceduresGroup</w:t>
       </w:r>
+      <w:proofErr w:type="spellEnd"/>
       <w:r>
         <w:t xml:space="preserve"> to eOutcome.09.</w:t>
       </w:r>
@@ -48686,6 +49158,7 @@
       <w:r>
         <w:t xml:space="preserve">Un-enclose from new element </w:t>
       </w:r>
+      <w:proofErr w:type="spellStart"/>
       <w:r>
         <w:t>eOutcome.</w:t>
       </w:r>
@@ -48695,15 +49168,22 @@
       <w:r>
         <w:t>ProceduresGroup</w:t>
       </w:r>
+      <w:proofErr w:type="spellEnd"/>
       <w:r>
         <w:t xml:space="preserve">. </w:t>
       </w:r>
+      <w:proofErr w:type="gramStart"/>
       <w:r>
         <w:t xml:space="preserve">Move </w:t>
       </w:r>
       <w:r>
-        <w:t xml:space="preserve">@CorrelationID from </w:t>
-      </w:r>
+        <w:t>@</w:t>
+      </w:r>
+      <w:proofErr w:type="gramEnd"/>
+      <w:r>
+        <w:t xml:space="preserve">CorrelationID from </w:t>
+      </w:r>
+      <w:proofErr w:type="spellStart"/>
       <w:r>
         <w:t>eOutcome.</w:t>
       </w:r>
@@ -48713,6 +49193,7 @@
       <w:r>
         <w:t>ProceduresGroup</w:t>
       </w:r>
+      <w:proofErr w:type="spellEnd"/>
       <w:r>
         <w:t xml:space="preserve"> to eOutcome.12.</w:t>
       </w:r>
@@ -49012,12 +49493,21 @@
                 <w:szCs w:val="18"/>
               </w:rPr>
             </w:pPr>
-            <w:r>
-              <w:rPr>
-                <w:sz w:val="18"/>
-                <w:szCs w:val="18"/>
-              </w:rPr>
-              <w:t>Symptom Not Present</w:t>
+            <w:proofErr w:type="gramStart"/>
+            <w:r>
+              <w:rPr>
+                <w:sz w:val="18"/>
+                <w:szCs w:val="18"/>
+              </w:rPr>
+              <w:t>Symptom</w:t>
+            </w:r>
+            <w:proofErr w:type="gramEnd"/>
+            <w:r>
+              <w:rPr>
+                <w:sz w:val="18"/>
+                <w:szCs w:val="18"/>
+              </w:rPr>
+              <w:t xml:space="preserve"> Not Present</w:t>
             </w:r>
           </w:p>
         </w:tc>
@@ -49033,9 +49523,11 @@
       <w:pPr>
         <w:pStyle w:val="Heading1"/>
       </w:pPr>
+      <w:proofErr w:type="spellStart"/>
       <w:r>
         <w:t>AnnualAgencyStatistics</w:t>
       </w:r>
+      <w:proofErr w:type="spellEnd"/>
     </w:p>
     <w:p>
       <w:r>
@@ -49447,20 +49939,35 @@
       </w:r>
     </w:p>
     <w:p>
+      <w:proofErr w:type="gramStart"/>
       <w:r>
         <w:t xml:space="preserve">Remove </w:t>
       </w:r>
       <w:r>
         <w:t>@</w:t>
       </w:r>
-      <w:r>
-        <w:t xml:space="preserve">CodeType. Remove instances where </w:t>
+      <w:proofErr w:type="gramEnd"/>
+      <w:r>
+        <w:t xml:space="preserve">CodeType. Remove instances </w:t>
+      </w:r>
+      <w:proofErr w:type="gramStart"/>
+      <w:r>
+        <w:t xml:space="preserve">where </w:t>
       </w:r>
       <w:r>
         <w:t>@</w:t>
       </w:r>
-      <w:r>
-        <w:t>CodeType is 9924005 (SNOMED) or value is longer than 7 characters. If no instances remain, insert one instance with value 7806 (Oxygen).</w:t>
+      <w:proofErr w:type="gramEnd"/>
+      <w:r>
+        <w:t xml:space="preserve">CodeType is 9924005 (SNOMED) or value is longer than 7 characters. If no instances remain, insert one instance with </w:t>
+      </w:r>
+      <w:proofErr w:type="gramStart"/>
+      <w:r>
+        <w:t>value</w:t>
+      </w:r>
+      <w:proofErr w:type="gramEnd"/>
+      <w:r>
+        <w:t xml:space="preserve"> 7806 (Oxygen).</w:t>
       </w:r>
     </w:p>
     <w:p>
@@ -49942,6 +50449,7 @@
                 <w:szCs w:val="18"/>
               </w:rPr>
             </w:pPr>
+            <w:proofErr w:type="spellStart"/>
             <w:r>
               <w:rPr>
                 <w:sz w:val="18"/>
@@ -49949,6 +50457,7 @@
               </w:rPr>
               <w:t>sdCustomConfiguration</w:t>
             </w:r>
+            <w:proofErr w:type="spellEnd"/>
           </w:p>
         </w:tc>
         <w:tc>
@@ -49962,6 +50471,7 @@
                 <w:szCs w:val="18"/>
               </w:rPr>
             </w:pPr>
+            <w:proofErr w:type="spellStart"/>
             <w:r>
               <w:rPr>
                 <w:sz w:val="18"/>
@@ -49969,6 +50479,7 @@
               </w:rPr>
               <w:t>dCustomConfiguration</w:t>
             </w:r>
+            <w:proofErr w:type="spellEnd"/>
           </w:p>
         </w:tc>
         <w:tc>
@@ -50004,12 +50515,21 @@
                 <w:szCs w:val="18"/>
               </w:rPr>
             </w:pPr>
-            <w:r>
-              <w:rPr>
-                <w:sz w:val="18"/>
-                <w:szCs w:val="18"/>
-              </w:rPr>
-              <w:t>sdCustomConfiguration.</w:t>
+            <w:proofErr w:type="spellStart"/>
+            <w:r>
+              <w:rPr>
+                <w:sz w:val="18"/>
+                <w:szCs w:val="18"/>
+              </w:rPr>
+              <w:t>sdCustomConfiguration</w:t>
+            </w:r>
+            <w:proofErr w:type="spellEnd"/>
+            <w:r>
+              <w:rPr>
+                <w:sz w:val="18"/>
+                <w:szCs w:val="18"/>
+              </w:rPr>
+              <w:t>.</w:t>
             </w:r>
             <w:r>
               <w:rPr>
@@ -50018,6 +50538,7 @@
               </w:rPr>
               <w:t xml:space="preserve"> ‌</w:t>
             </w:r>
+            <w:proofErr w:type="spellStart"/>
             <w:r>
               <w:rPr>
                 <w:sz w:val="18"/>
@@ -50025,6 +50546,7 @@
               </w:rPr>
               <w:t>CustomGroup</w:t>
             </w:r>
+            <w:proofErr w:type="spellEnd"/>
           </w:p>
         </w:tc>
         <w:tc>
@@ -50038,12 +50560,21 @@
                 <w:szCs w:val="18"/>
               </w:rPr>
             </w:pPr>
-            <w:r>
-              <w:rPr>
-                <w:sz w:val="18"/>
-                <w:szCs w:val="18"/>
-              </w:rPr>
-              <w:t>dCustomConfiguration.</w:t>
+            <w:proofErr w:type="spellStart"/>
+            <w:r>
+              <w:rPr>
+                <w:sz w:val="18"/>
+                <w:szCs w:val="18"/>
+              </w:rPr>
+              <w:t>dCustomConfiguration</w:t>
+            </w:r>
+            <w:proofErr w:type="spellEnd"/>
+            <w:r>
+              <w:rPr>
+                <w:sz w:val="18"/>
+                <w:szCs w:val="18"/>
+              </w:rPr>
+              <w:t>.</w:t>
             </w:r>
             <w:r>
               <w:rPr>
@@ -50052,6 +50583,7 @@
               </w:rPr>
               <w:t>‌</w:t>
             </w:r>
+            <w:proofErr w:type="spellStart"/>
             <w:r>
               <w:rPr>
                 <w:sz w:val="18"/>
@@ -50059,6 +50591,7 @@
               </w:rPr>
               <w:t>CustomGroup</w:t>
             </w:r>
+            <w:proofErr w:type="spellEnd"/>
           </w:p>
         </w:tc>
         <w:tc>
@@ -50715,6 +51248,7 @@
                 <w:szCs w:val="18"/>
               </w:rPr>
             </w:pPr>
+            <w:proofErr w:type="spellStart"/>
             <w:r>
               <w:rPr>
                 <w:sz w:val="18"/>
@@ -50722,6 +51256,7 @@
               </w:rPr>
               <w:t>seCustomConfiguration</w:t>
             </w:r>
+            <w:proofErr w:type="spellEnd"/>
           </w:p>
         </w:tc>
         <w:tc>
@@ -50735,6 +51270,7 @@
                 <w:szCs w:val="18"/>
               </w:rPr>
             </w:pPr>
+            <w:proofErr w:type="spellStart"/>
             <w:r>
               <w:rPr>
                 <w:sz w:val="18"/>
@@ -50742,6 +51278,7 @@
               </w:rPr>
               <w:t>eCustomConfiguration</w:t>
             </w:r>
+            <w:proofErr w:type="spellEnd"/>
           </w:p>
         </w:tc>
         <w:tc>
@@ -50777,12 +51314,21 @@
                 <w:szCs w:val="18"/>
               </w:rPr>
             </w:pPr>
-            <w:r>
-              <w:rPr>
-                <w:sz w:val="18"/>
-                <w:szCs w:val="18"/>
-              </w:rPr>
-              <w:t>seCustomConfiguration.</w:t>
+            <w:proofErr w:type="spellStart"/>
+            <w:r>
+              <w:rPr>
+                <w:sz w:val="18"/>
+                <w:szCs w:val="18"/>
+              </w:rPr>
+              <w:t>seCustomConfiguration</w:t>
+            </w:r>
+            <w:proofErr w:type="spellEnd"/>
+            <w:r>
+              <w:rPr>
+                <w:sz w:val="18"/>
+                <w:szCs w:val="18"/>
+              </w:rPr>
+              <w:t>.</w:t>
             </w:r>
             <w:r>
               <w:rPr>
@@ -50791,6 +51337,7 @@
               </w:rPr>
               <w:t xml:space="preserve"> ‌</w:t>
             </w:r>
+            <w:proofErr w:type="spellStart"/>
             <w:r>
               <w:rPr>
                 <w:sz w:val="18"/>
@@ -50798,6 +51345,7 @@
               </w:rPr>
               <w:t>CustomGroup</w:t>
             </w:r>
+            <w:proofErr w:type="spellEnd"/>
           </w:p>
         </w:tc>
         <w:tc>
@@ -50811,12 +51359,21 @@
                 <w:szCs w:val="18"/>
               </w:rPr>
             </w:pPr>
-            <w:r>
-              <w:rPr>
-                <w:sz w:val="18"/>
-                <w:szCs w:val="18"/>
-              </w:rPr>
-              <w:t>eCustomConfiguration.</w:t>
+            <w:proofErr w:type="spellStart"/>
+            <w:r>
+              <w:rPr>
+                <w:sz w:val="18"/>
+                <w:szCs w:val="18"/>
+              </w:rPr>
+              <w:t>eCustomConfiguration</w:t>
+            </w:r>
+            <w:proofErr w:type="spellEnd"/>
+            <w:r>
+              <w:rPr>
+                <w:sz w:val="18"/>
+                <w:szCs w:val="18"/>
+              </w:rPr>
+              <w:t>.</w:t>
             </w:r>
             <w:r>
               <w:rPr>
@@ -50825,6 +51382,7 @@
               </w:rPr>
               <w:t xml:space="preserve"> ‌</w:t>
             </w:r>
+            <w:proofErr w:type="spellStart"/>
             <w:r>
               <w:rPr>
                 <w:sz w:val="18"/>
@@ -50832,6 +51390,7 @@
               </w:rPr>
               <w:t>CustomGroup</w:t>
             </w:r>
+            <w:proofErr w:type="spellEnd"/>
           </w:p>
         </w:tc>
         <w:tc>
@@ -51488,6 +52047,7 @@
                 <w:szCs w:val="18"/>
               </w:rPr>
             </w:pPr>
+            <w:proofErr w:type="spellStart"/>
             <w:r>
               <w:rPr>
                 <w:sz w:val="18"/>
@@ -51495,6 +52055,7 @@
               </w:rPr>
               <w:t>sElement</w:t>
             </w:r>
+            <w:proofErr w:type="spellEnd"/>
           </w:p>
         </w:tc>
         <w:tc>
@@ -51508,6 +52069,7 @@
                 <w:szCs w:val="18"/>
               </w:rPr>
             </w:pPr>
+            <w:proofErr w:type="spellStart"/>
             <w:r>
               <w:rPr>
                 <w:sz w:val="18"/>
@@ -51515,6 +52077,7 @@
               </w:rPr>
               <w:t>dState</w:t>
             </w:r>
+            <w:proofErr w:type="spellEnd"/>
           </w:p>
         </w:tc>
         <w:tc>
@@ -51617,6 +52180,7 @@
                 <w:szCs w:val="18"/>
               </w:rPr>
             </w:pPr>
+            <w:proofErr w:type="spellStart"/>
             <w:r>
               <w:rPr>
                 <w:sz w:val="18"/>
@@ -51624,6 +52188,7 @@
               </w:rPr>
               <w:t>sElement</w:t>
             </w:r>
+            <w:proofErr w:type="spellEnd"/>
           </w:p>
         </w:tc>
         <w:tc>
@@ -51637,6 +52202,7 @@
                 <w:szCs w:val="18"/>
               </w:rPr>
             </w:pPr>
+            <w:proofErr w:type="spellStart"/>
             <w:r>
               <w:rPr>
                 <w:sz w:val="18"/>
@@ -51644,6 +52210,7 @@
               </w:rPr>
               <w:t>eState</w:t>
             </w:r>
+            <w:proofErr w:type="spellEnd"/>
           </w:p>
         </w:tc>
         <w:tc>
@@ -51747,6 +52314,7 @@
                 <w:szCs w:val="18"/>
               </w:rPr>
             </w:pPr>
+            <w:proofErr w:type="spellStart"/>
             <w:r>
               <w:rPr>
                 <w:sz w:val="18"/>
@@ -51754,6 +52322,7 @@
               </w:rPr>
               <w:t>sConfiguration</w:t>
             </w:r>
+            <w:proofErr w:type="spellEnd"/>
           </w:p>
         </w:tc>
         <w:tc>
@@ -51767,6 +52336,7 @@
                 <w:szCs w:val="18"/>
               </w:rPr>
             </w:pPr>
+            <w:proofErr w:type="spellStart"/>
             <w:r>
               <w:rPr>
                 <w:sz w:val="18"/>
@@ -51774,6 +52344,7 @@
               </w:rPr>
               <w:t>dConfiguration</w:t>
             </w:r>
+            <w:proofErr w:type="spellEnd"/>
           </w:p>
         </w:tc>
         <w:tc>
@@ -51878,12 +52449,21 @@
                 <w:szCs w:val="18"/>
               </w:rPr>
             </w:pPr>
-            <w:r>
-              <w:rPr>
-                <w:sz w:val="18"/>
-                <w:szCs w:val="18"/>
-              </w:rPr>
-              <w:t>sConfiguration.</w:t>
+            <w:proofErr w:type="spellStart"/>
+            <w:r>
+              <w:rPr>
+                <w:sz w:val="18"/>
+                <w:szCs w:val="18"/>
+              </w:rPr>
+              <w:t>sConfiguration</w:t>
+            </w:r>
+            <w:proofErr w:type="spellEnd"/>
+            <w:r>
+              <w:rPr>
+                <w:sz w:val="18"/>
+                <w:szCs w:val="18"/>
+              </w:rPr>
+              <w:t>.</w:t>
             </w:r>
             <w:r>
               <w:rPr>
@@ -51892,6 +52472,7 @@
               </w:rPr>
               <w:t xml:space="preserve"> ‌</w:t>
             </w:r>
+            <w:proofErr w:type="spellStart"/>
             <w:r>
               <w:rPr>
                 <w:sz w:val="18"/>
@@ -51899,6 +52480,7 @@
               </w:rPr>
               <w:t>ProcedureGroup</w:t>
             </w:r>
+            <w:proofErr w:type="spellEnd"/>
           </w:p>
         </w:tc>
         <w:tc>
@@ -51912,12 +52494,21 @@
                 <w:szCs w:val="18"/>
               </w:rPr>
             </w:pPr>
-            <w:r>
-              <w:rPr>
-                <w:sz w:val="18"/>
-                <w:szCs w:val="18"/>
-              </w:rPr>
-              <w:t>dConfiguration.</w:t>
+            <w:proofErr w:type="spellStart"/>
+            <w:r>
+              <w:rPr>
+                <w:sz w:val="18"/>
+                <w:szCs w:val="18"/>
+              </w:rPr>
+              <w:t>dConfiguration</w:t>
+            </w:r>
+            <w:proofErr w:type="spellEnd"/>
+            <w:r>
+              <w:rPr>
+                <w:sz w:val="18"/>
+                <w:szCs w:val="18"/>
+              </w:rPr>
+              <w:t>.</w:t>
             </w:r>
             <w:r>
               <w:rPr>
@@ -51926,6 +52517,7 @@
               </w:rPr>
               <w:t xml:space="preserve"> ‌</w:t>
             </w:r>
+            <w:proofErr w:type="spellStart"/>
             <w:r>
               <w:rPr>
                 <w:sz w:val="18"/>
@@ -51933,6 +52525,7 @@
               </w:rPr>
               <w:t>ProcedureGroup</w:t>
             </w:r>
+            <w:proofErr w:type="spellEnd"/>
           </w:p>
         </w:tc>
         <w:tc>
@@ -52106,12 +52699,21 @@
                 <w:szCs w:val="18"/>
               </w:rPr>
             </w:pPr>
-            <w:r>
-              <w:rPr>
-                <w:sz w:val="18"/>
-                <w:szCs w:val="18"/>
-              </w:rPr>
-              <w:t>sConfiguration.</w:t>
+            <w:proofErr w:type="spellStart"/>
+            <w:r>
+              <w:rPr>
+                <w:sz w:val="18"/>
+                <w:szCs w:val="18"/>
+              </w:rPr>
+              <w:t>sConfiguration</w:t>
+            </w:r>
+            <w:proofErr w:type="spellEnd"/>
+            <w:r>
+              <w:rPr>
+                <w:sz w:val="18"/>
+                <w:szCs w:val="18"/>
+              </w:rPr>
+              <w:t>.</w:t>
             </w:r>
             <w:r>
               <w:rPr>
@@ -52120,6 +52722,7 @@
               </w:rPr>
               <w:t xml:space="preserve"> ‌</w:t>
             </w:r>
+            <w:proofErr w:type="spellStart"/>
             <w:r>
               <w:rPr>
                 <w:sz w:val="18"/>
@@ -52127,6 +52730,7 @@
               </w:rPr>
               <w:t>MedicationGroup</w:t>
             </w:r>
+            <w:proofErr w:type="spellEnd"/>
           </w:p>
         </w:tc>
         <w:tc>
@@ -52140,12 +52744,21 @@
                 <w:szCs w:val="18"/>
               </w:rPr>
             </w:pPr>
-            <w:r>
-              <w:rPr>
-                <w:sz w:val="18"/>
-                <w:szCs w:val="18"/>
-              </w:rPr>
-              <w:t>dConfiguration.</w:t>
+            <w:proofErr w:type="spellStart"/>
+            <w:r>
+              <w:rPr>
+                <w:sz w:val="18"/>
+                <w:szCs w:val="18"/>
+              </w:rPr>
+              <w:t>dConfiguration</w:t>
+            </w:r>
+            <w:proofErr w:type="spellEnd"/>
+            <w:r>
+              <w:rPr>
+                <w:sz w:val="18"/>
+                <w:szCs w:val="18"/>
+              </w:rPr>
+              <w:t>.</w:t>
             </w:r>
             <w:r>
               <w:rPr>
@@ -52154,6 +52767,7 @@
               </w:rPr>
               <w:t xml:space="preserve"> ‌</w:t>
             </w:r>
+            <w:proofErr w:type="spellStart"/>
             <w:r>
               <w:rPr>
                 <w:sz w:val="18"/>
@@ -52161,6 +52775,7 @@
               </w:rPr>
               <w:t>MedicationGroup</w:t>
             </w:r>
+            <w:proofErr w:type="spellEnd"/>
           </w:p>
         </w:tc>
         <w:tc>
@@ -52403,6 +53018,7 @@
                 <w:szCs w:val="18"/>
               </w:rPr>
             </w:pPr>
+            <w:proofErr w:type="spellStart"/>
             <w:r>
               <w:rPr>
                 <w:sz w:val="18"/>
@@ -52410,6 +53026,7 @@
               </w:rPr>
               <w:t>sAgency</w:t>
             </w:r>
+            <w:proofErr w:type="spellEnd"/>
           </w:p>
         </w:tc>
         <w:tc>
@@ -52423,6 +53040,7 @@
                 <w:szCs w:val="18"/>
               </w:rPr>
             </w:pPr>
+            <w:proofErr w:type="spellStart"/>
             <w:r>
               <w:rPr>
                 <w:sz w:val="18"/>
@@ -52430,6 +53048,7 @@
               </w:rPr>
               <w:t>dAgency</w:t>
             </w:r>
+            <w:proofErr w:type="spellEnd"/>
           </w:p>
         </w:tc>
         <w:tc>
@@ -52465,6 +53084,7 @@
                 <w:szCs w:val="18"/>
               </w:rPr>
             </w:pPr>
+            <w:proofErr w:type="spellStart"/>
             <w:r>
               <w:rPr>
                 <w:sz w:val="18"/>
@@ -52472,6 +53092,7 @@
               </w:rPr>
               <w:t>sAgencyGroup</w:t>
             </w:r>
+            <w:proofErr w:type="spellEnd"/>
           </w:p>
         </w:tc>
         <w:tc>
@@ -52485,6 +53106,7 @@
                 <w:szCs w:val="18"/>
               </w:rPr>
             </w:pPr>
+            <w:proofErr w:type="spellStart"/>
             <w:r>
               <w:rPr>
                 <w:sz w:val="18"/>
@@ -52492,6 +53114,7 @@
               </w:rPr>
               <w:t>dAgencyGroup</w:t>
             </w:r>
+            <w:proofErr w:type="spellEnd"/>
           </w:p>
         </w:tc>
         <w:tc>
@@ -52734,6 +53357,7 @@
                 <w:szCs w:val="18"/>
               </w:rPr>
             </w:pPr>
+            <w:proofErr w:type="spellStart"/>
             <w:r>
               <w:rPr>
                 <w:sz w:val="18"/>
@@ -52741,6 +53365,7 @@
               </w:rPr>
               <w:t>sFacility</w:t>
             </w:r>
+            <w:proofErr w:type="spellEnd"/>
           </w:p>
         </w:tc>
         <w:tc>
@@ -52754,6 +53379,7 @@
                 <w:szCs w:val="18"/>
               </w:rPr>
             </w:pPr>
+            <w:proofErr w:type="spellStart"/>
             <w:r>
               <w:rPr>
                 <w:sz w:val="18"/>
@@ -52761,6 +53387,7 @@
               </w:rPr>
               <w:t>dFacility</w:t>
             </w:r>
+            <w:proofErr w:type="spellEnd"/>
           </w:p>
         </w:tc>
         <w:tc>
@@ -52796,6 +53423,7 @@
                 <w:szCs w:val="18"/>
               </w:rPr>
             </w:pPr>
+            <w:proofErr w:type="spellStart"/>
             <w:r>
               <w:rPr>
                 <w:sz w:val="18"/>
@@ -52803,6 +53431,7 @@
               </w:rPr>
               <w:t>sFacilityGroup</w:t>
             </w:r>
+            <w:proofErr w:type="spellEnd"/>
           </w:p>
         </w:tc>
         <w:tc>
@@ -52816,6 +53445,7 @@
                 <w:szCs w:val="18"/>
               </w:rPr>
             </w:pPr>
+            <w:proofErr w:type="spellStart"/>
             <w:r>
               <w:rPr>
                 <w:sz w:val="18"/>
@@ -52823,6 +53453,7 @@
               </w:rPr>
               <w:t>dFacilityGroup</w:t>
             </w:r>
+            <w:proofErr w:type="spellEnd"/>
           </w:p>
         </w:tc>
         <w:tc>
@@ -52927,6 +53558,7 @@
                 <w:szCs w:val="18"/>
               </w:rPr>
             </w:pPr>
+            <w:proofErr w:type="spellStart"/>
             <w:r>
               <w:rPr>
                 <w:sz w:val="18"/>
@@ -52934,6 +53566,7 @@
               </w:rPr>
               <w:t>sFacility.FacilityGroup</w:t>
             </w:r>
+            <w:proofErr w:type="spellEnd"/>
           </w:p>
         </w:tc>
         <w:tc>
@@ -52947,6 +53580,7 @@
                 <w:szCs w:val="18"/>
               </w:rPr>
             </w:pPr>
+            <w:proofErr w:type="spellStart"/>
             <w:r>
               <w:rPr>
                 <w:sz w:val="18"/>
@@ -52954,6 +53588,7 @@
               </w:rPr>
               <w:t>dFacility.FacilityGroup</w:t>
             </w:r>
+            <w:proofErr w:type="spellEnd"/>
           </w:p>
         </w:tc>
         <w:tc>
@@ -53944,13 +54579,19 @@
       <w:pPr>
         <w:pStyle w:val="Heading1"/>
       </w:pPr>
+      <w:proofErr w:type="spellStart"/>
       <w:r>
         <w:t>seCustomConfiguration</w:t>
       </w:r>
+      <w:proofErr w:type="spellEnd"/>
       <w:r>
         <w:br/>
+      </w:r>
+      <w:proofErr w:type="spellStart"/>
+      <w:r>
         <w:t>sdCustomConfiguration</w:t>
       </w:r>
+      <w:proofErr w:type="spellEnd"/>
     </w:p>
     <w:p>
       <w:r>
@@ -53975,8 +54616,44 @@
       </w:r>
     </w:p>
     <w:p>
-      <w:r>
-        <w:t>Remove @EffectiveDate.</w:t>
+      <w:proofErr w:type="gramStart"/>
+      <w:r>
+        <w:t>Remove @</w:t>
+      </w:r>
+      <w:proofErr w:type="gramEnd"/>
+      <w:r>
+        <w:t>EffectiveDate.</w:t>
+      </w:r>
+    </w:p>
+    <w:p>
+      <w:pPr>
+        <w:pStyle w:val="Heading1"/>
+        <w:tabs>
+          <w:tab w:val="left" w:pos="7608"/>
+        </w:tabs>
+      </w:pPr>
+      <w:r>
+        <w:lastRenderedPageBreak/>
+        <w:t xml:space="preserve">sState.01 - </w:t>
+      </w:r>
+      <w:r>
+        <w:t>State</w:t>
+      </w:r>
+      <w:r>
+        <w:tab/>
+      </w:r>
+    </w:p>
+    <w:p>
+      <w:r>
+        <w:t xml:space="preserve">Un-enclose from </w:t>
+      </w:r>
+      <w:proofErr w:type="spellStart"/>
+      <w:r>
+        <w:t>sState</w:t>
+      </w:r>
+      <w:proofErr w:type="spellEnd"/>
+      <w:r>
+        <w:t xml:space="preserve"> element.</w:t>
       </w:r>
     </w:p>
     <w:p>
@@ -53984,41 +54661,56 @@
         <w:pStyle w:val="Heading1"/>
       </w:pPr>
       <w:r>
-        <w:lastRenderedPageBreak/>
-        <w:t xml:space="preserve">sState.01 - </w:t>
-      </w:r>
-      <w:r>
-        <w:t>State</w:t>
+        <w:t xml:space="preserve">sElement.01 - </w:t>
+      </w:r>
+      <w:r>
+        <w:t>State Collected Element</w:t>
       </w:r>
     </w:p>
     <w:p>
       <w:r>
-        <w:t>Un-enclose from sState element.</w:t>
-      </w:r>
-    </w:p>
-    <w:p>
-      <w:pPr>
-        <w:pStyle w:val="Heading1"/>
-      </w:pPr>
-      <w:r>
-        <w:t xml:space="preserve">sElement.01 - </w:t>
-      </w:r>
-      <w:r>
-        <w:t>State Collected Element</w:t>
-      </w:r>
-    </w:p>
-    <w:p>
-      <w:r>
         <w:t>Split i</w:t>
       </w:r>
       <w:r>
         <w:t xml:space="preserve">nstances </w:t>
       </w:r>
       <w:r>
-        <w:t>into dState/dState.01 and eState/eState.01</w:t>
-      </w:r>
-      <w:r>
-        <w:t xml:space="preserve"> based the first character of the element value:</w:t>
+        <w:t xml:space="preserve">into </w:t>
+      </w:r>
+      <w:proofErr w:type="spellStart"/>
+      <w:r>
+        <w:t>dState</w:t>
+      </w:r>
+      <w:proofErr w:type="spellEnd"/>
+      <w:r>
+        <w:t xml:space="preserve">/dState.01 and </w:t>
+      </w:r>
+      <w:proofErr w:type="spellStart"/>
+      <w:r>
+        <w:t>eState</w:t>
+      </w:r>
+      <w:proofErr w:type="spellEnd"/>
+      <w:r>
+        <w:t>/</w:t>
+      </w:r>
+      <w:proofErr w:type="gramStart"/>
+      <w:r>
+        <w:t>eState</w:t>
+      </w:r>
+      <w:proofErr w:type="gramEnd"/>
+      <w:r>
+        <w:t>.01</w:t>
+      </w:r>
+      <w:r>
+        <w:t xml:space="preserve"> </w:t>
+      </w:r>
+      <w:proofErr w:type="gramStart"/>
+      <w:r>
+        <w:t>based</w:t>
+      </w:r>
+      <w:proofErr w:type="gramEnd"/>
+      <w:r>
+        <w:t xml:space="preserve"> the first character of the element value:</w:t>
       </w:r>
     </w:p>
     <w:p>
@@ -54081,18 +54773,25 @@
       </w:r>
     </w:p>
     <w:p>
+      <w:proofErr w:type="gramStart"/>
       <w:r>
         <w:t xml:space="preserve">Remove </w:t>
       </w:r>
       <w:r>
         <w:t>@</w:t>
       </w:r>
-      <w:r>
-        <w:t xml:space="preserve">CodeType. Remove instances where </w:t>
+      <w:proofErr w:type="gramEnd"/>
+      <w:r>
+        <w:t xml:space="preserve">CodeType. Remove instances </w:t>
+      </w:r>
+      <w:proofErr w:type="gramStart"/>
+      <w:r>
+        <w:t xml:space="preserve">where </w:t>
       </w:r>
       <w:r>
         <w:t>@</w:t>
       </w:r>
+      <w:proofErr w:type="gramEnd"/>
       <w:r>
         <w:t>CodeType is 9924005 (SNOMED) or value is longer than 7 characters.</w:t>
       </w:r>

</xml_diff>